<commit_message>
add CV all pages
</commit_message>
<xml_diff>
--- a/assets/cv/Miguel_Angel_Cabello_Mesa_CV.docx
+++ b/assets/cv/Miguel_Angel_Cabello_Mesa_CV.docx
@@ -131,7 +131,7 @@
           <w:bCs/>
         </w:rPr>
         <w:pict w14:anchorId="0B1F10B8">
-          <v:rect id="_x0000_i1167" style="width:0;height:1.5pt" o:hralign="center" o:hrstd="t" o:hr="t" fillcolor="#a0a0a0" stroked="f"/>
+          <v:rect id="_x0000_i1025" style="width:0;height:1.5pt" o:hralign="center" o:hrstd="t" o:hr="t" fillcolor="#a0a0a0" stroked="f"/>
         </w:pict>
       </w:r>
     </w:p>
@@ -178,7 +178,7 @@
           <w:bCs/>
         </w:rPr>
         <w:pict w14:anchorId="41D1242E">
-          <v:rect id="_x0000_i1168" style="width:0;height:1.5pt" o:hralign="center" o:hrstd="t" o:hr="t" fillcolor="#a0a0a0" stroked="f"/>
+          <v:rect id="_x0000_i1026" style="width:0;height:1.5pt" o:hralign="center" o:hrstd="t" o:hr="t" fillcolor="#a0a0a0" stroked="f"/>
         </w:pict>
       </w:r>
     </w:p>
@@ -224,7 +224,7 @@
           <w:b/>
           <w:bCs/>
         </w:rPr>
-        <w:t>Centro educativo</w:t>
+        <w:t>IES Aguasdulce</w:t>
       </w:r>
       <w:r>
         <w:rPr>
@@ -342,8 +342,8 @@
           <w:b/>
           <w:bCs/>
         </w:rPr>
-        <w:pict w14:anchorId="0F65E18A">
-          <v:rect id="_x0000_i1169" style="width:0;height:1.5pt" o:hralign="center" o:hrstd="t" o:hr="t" fillcolor="#a0a0a0" stroked="f"/>
+        <w:pict w14:anchorId="528A2307">
+          <v:rect id="_x0000_i1028" style="width:0;height:1.5pt" o:hralign="center" o:hrstd="t" o:hr="t" fillcolor="#a0a0a0" stroked="f"/>
         </w:pict>
       </w:r>
     </w:p>
@@ -359,7 +359,7 @@
           <w:b/>
           <w:bCs/>
         </w:rPr>
-        <w:t>PROYECTOS DESTACADOS</w:t>
+        <w:t>EXPERIENCIA PROFESIONAL</w:t>
       </w:r>
     </w:p>
     <w:p>
@@ -374,7 +374,21 @@
           <w:b/>
           <w:bCs/>
         </w:rPr>
-        <w:t>Portfolio Personal</w:t>
+        <w:t>Marmolista – Mármoles Cabello (</w:t>
+      </w:r>
+      <w:r>
+        <w:rPr>
+          <w:b/>
+          <w:bCs/>
+        </w:rPr>
+        <w:t>E</w:t>
+      </w:r>
+      <w:r>
+        <w:rPr>
+          <w:b/>
+          <w:bCs/>
+        </w:rPr>
+        <w:t>mpresa familiar)</w:t>
       </w:r>
     </w:p>
     <w:p>
@@ -389,14 +403,14 @@
           <w:b/>
           <w:bCs/>
         </w:rPr>
-        <w:t>Tecnologías: HTML, CSS, JavaScript, Tailwind CSS</w:t>
+        <w:t>2013 – Actualidad</w:t>
       </w:r>
     </w:p>
     <w:p>
       <w:pPr>
         <w:numPr>
           <w:ilvl w:val="0"/>
-          <w:numId w:val="21"/>
+          <w:numId w:val="24"/>
         </w:numPr>
         <w:rPr>
           <w:b/>
@@ -408,14 +422,14 @@
           <w:b/>
           <w:bCs/>
         </w:rPr>
-        <w:t>Web personal para mostrar proyectos</w:t>
+        <w:t>Fabricación y montaje de elementos de piedra natural</w:t>
       </w:r>
     </w:p>
     <w:p>
       <w:pPr>
         <w:numPr>
           <w:ilvl w:val="0"/>
-          <w:numId w:val="21"/>
+          <w:numId w:val="24"/>
         </w:numPr>
         <w:rPr>
           <w:b/>
@@ -427,14 +441,14 @@
           <w:b/>
           <w:bCs/>
         </w:rPr>
-        <w:t>Diseño responsive adaptado a dispositivos móviles y escritorio</w:t>
+        <w:t>Interpretación de planos y medidas</w:t>
       </w:r>
     </w:p>
     <w:p>
       <w:pPr>
         <w:numPr>
           <w:ilvl w:val="0"/>
-          <w:numId w:val="21"/>
+          <w:numId w:val="24"/>
         </w:numPr>
         <w:rPr>
           <w:b/>
@@ -446,11 +460,15 @@
           <w:b/>
           <w:bCs/>
         </w:rPr>
-        <w:t>Animaciones e interacciones modernas</w:t>
+        <w:t>Manejo de maquinaria especializada</w:t>
       </w:r>
     </w:p>
     <w:p>
       <w:pPr>
+        <w:numPr>
+          <w:ilvl w:val="0"/>
+          <w:numId w:val="24"/>
+        </w:numPr>
         <w:rPr>
           <w:b/>
           <w:bCs/>
@@ -461,7 +479,7 @@
           <w:b/>
           <w:bCs/>
         </w:rPr>
-        <w:t>Calculadora Web</w:t>
+        <w:t>Trabajo en equipo en entorno industrial</w:t>
       </w:r>
     </w:p>
     <w:p>
@@ -476,168 +494,8 @@
           <w:b/>
           <w:bCs/>
         </w:rPr>
-        <w:t>Tecnologías: HTML, CSS, JavaScript</w:t>
-      </w:r>
-    </w:p>
-    <w:p>
-      <w:pPr>
-        <w:numPr>
-          <w:ilvl w:val="0"/>
-          <w:numId w:val="22"/>
-        </w:numPr>
-        <w:rPr>
-          <w:b/>
-          <w:bCs/>
-        </w:rPr>
-      </w:pPr>
-      <w:r>
-        <w:rPr>
-          <w:b/>
-          <w:bCs/>
-        </w:rPr>
-        <w:t>Aplicación funcional de cálculo</w:t>
-      </w:r>
-    </w:p>
-    <w:p>
-      <w:pPr>
-        <w:numPr>
-          <w:ilvl w:val="0"/>
-          <w:numId w:val="22"/>
-        </w:numPr>
-        <w:rPr>
-          <w:b/>
-          <w:bCs/>
-        </w:rPr>
-      </w:pPr>
-      <w:r>
-        <w:rPr>
-          <w:b/>
-          <w:bCs/>
-        </w:rPr>
-        <w:t>Validación de datos introducidos por el usuario</w:t>
-      </w:r>
-    </w:p>
-    <w:p>
-      <w:pPr>
-        <w:numPr>
-          <w:ilvl w:val="0"/>
-          <w:numId w:val="22"/>
-        </w:numPr>
-        <w:rPr>
-          <w:b/>
-          <w:bCs/>
-        </w:rPr>
-      </w:pPr>
-      <w:r>
-        <w:rPr>
-          <w:b/>
-          <w:bCs/>
-        </w:rPr>
-        <w:t>Interfaz simple y accesible</w:t>
-      </w:r>
-    </w:p>
-    <w:p>
-      <w:pPr>
-        <w:rPr>
-          <w:b/>
-          <w:bCs/>
-        </w:rPr>
-      </w:pPr>
-      <w:r>
-        <w:rPr>
-          <w:b/>
-          <w:bCs/>
-        </w:rPr>
-        <w:lastRenderedPageBreak/>
-        <w:t>Mini gestor de datos</w:t>
-      </w:r>
-    </w:p>
-    <w:p>
-      <w:pPr>
-        <w:rPr>
-          <w:b/>
-          <w:bCs/>
-        </w:rPr>
-      </w:pPr>
-      <w:r>
-        <w:rPr>
-          <w:b/>
-          <w:bCs/>
-        </w:rPr>
-        <w:t>Tecnologías: JavaScript, PHP, MySQL</w:t>
-      </w:r>
-    </w:p>
-    <w:p>
-      <w:pPr>
-        <w:numPr>
-          <w:ilvl w:val="0"/>
-          <w:numId w:val="23"/>
-        </w:numPr>
-        <w:rPr>
-          <w:b/>
-          <w:bCs/>
-        </w:rPr>
-      </w:pPr>
-      <w:r>
-        <w:rPr>
-          <w:b/>
-          <w:bCs/>
-        </w:rPr>
-        <w:t>Gestión básica de registros</w:t>
-      </w:r>
-    </w:p>
-    <w:p>
-      <w:pPr>
-        <w:numPr>
-          <w:ilvl w:val="0"/>
-          <w:numId w:val="23"/>
-        </w:numPr>
-        <w:rPr>
-          <w:b/>
-          <w:bCs/>
-        </w:rPr>
-      </w:pPr>
-      <w:r>
-        <w:rPr>
-          <w:b/>
-          <w:bCs/>
-        </w:rPr>
-        <w:t>Operaciones CRUD sencillas</w:t>
-      </w:r>
-    </w:p>
-    <w:p>
-      <w:pPr>
-        <w:numPr>
-          <w:ilvl w:val="0"/>
-          <w:numId w:val="23"/>
-        </w:numPr>
-        <w:rPr>
-          <w:b/>
-          <w:bCs/>
-        </w:rPr>
-      </w:pPr>
-      <w:r>
-        <w:rPr>
-          <w:b/>
-          <w:bCs/>
-        </w:rPr>
-        <w:t>Conexión con base de datos</w:t>
-      </w:r>
-    </w:p>
-    <w:p>
-      <w:pPr>
-        <w:rPr>
-          <w:b/>
-          <w:bCs/>
-        </w:rPr>
-      </w:pPr>
-      <w:r>
-        <w:rPr>
-          <w:b/>
-          <w:bCs/>
-        </w:rPr>
-        <w:pict w14:anchorId="528A2307">
-          <v:rect id="_x0000_i1170" style="width:0;height:1.5pt" o:hralign="center" o:hrstd="t" o:hr="t" fillcolor="#a0a0a0" stroked="f"/>
+        <w:pict w14:anchorId="186EB0B7">
+          <v:rect id="_x0000_i1029" style="width:0;height:1.5pt" o:hralign="center" o:hrstd="t" o:hr="t" fillcolor="#a0a0a0" stroked="f"/>
         </w:pict>
       </w:r>
     </w:p>
@@ -653,144 +511,6 @@
           <w:b/>
           <w:bCs/>
         </w:rPr>
-        <w:t>EXPERIENCIA PROFESIONAL</w:t>
-      </w:r>
-    </w:p>
-    <w:p>
-      <w:pPr>
-        <w:rPr>
-          <w:b/>
-          <w:bCs/>
-        </w:rPr>
-      </w:pPr>
-      <w:r>
-        <w:rPr>
-          <w:b/>
-          <w:bCs/>
-        </w:rPr>
-        <w:t>Marmolista – Mármoles Cabello (empresa familiar)</w:t>
-      </w:r>
-    </w:p>
-    <w:p>
-      <w:pPr>
-        <w:rPr>
-          <w:b/>
-          <w:bCs/>
-        </w:rPr>
-      </w:pPr>
-      <w:r>
-        <w:rPr>
-          <w:b/>
-          <w:bCs/>
-        </w:rPr>
-        <w:t>2013 – Actualidad</w:t>
-      </w:r>
-    </w:p>
-    <w:p>
-      <w:pPr>
-        <w:numPr>
-          <w:ilvl w:val="0"/>
-          <w:numId w:val="24"/>
-        </w:numPr>
-        <w:rPr>
-          <w:b/>
-          <w:bCs/>
-        </w:rPr>
-      </w:pPr>
-      <w:r>
-        <w:rPr>
-          <w:b/>
-          <w:bCs/>
-        </w:rPr>
-        <w:t>Fabricación y montaje de elementos de piedra natural</w:t>
-      </w:r>
-    </w:p>
-    <w:p>
-      <w:pPr>
-        <w:numPr>
-          <w:ilvl w:val="0"/>
-          <w:numId w:val="24"/>
-        </w:numPr>
-        <w:rPr>
-          <w:b/>
-          <w:bCs/>
-        </w:rPr>
-      </w:pPr>
-      <w:r>
-        <w:rPr>
-          <w:b/>
-          <w:bCs/>
-        </w:rPr>
-        <w:t>Interpretación de planos y medidas</w:t>
-      </w:r>
-    </w:p>
-    <w:p>
-      <w:pPr>
-        <w:numPr>
-          <w:ilvl w:val="0"/>
-          <w:numId w:val="24"/>
-        </w:numPr>
-        <w:rPr>
-          <w:b/>
-          <w:bCs/>
-        </w:rPr>
-      </w:pPr>
-      <w:r>
-        <w:rPr>
-          <w:b/>
-          <w:bCs/>
-        </w:rPr>
-        <w:t>Manejo de maquinaria especializada</w:t>
-      </w:r>
-    </w:p>
-    <w:p>
-      <w:pPr>
-        <w:numPr>
-          <w:ilvl w:val="0"/>
-          <w:numId w:val="24"/>
-        </w:numPr>
-        <w:rPr>
-          <w:b/>
-          <w:bCs/>
-        </w:rPr>
-      </w:pPr>
-      <w:r>
-        <w:rPr>
-          <w:b/>
-          <w:bCs/>
-        </w:rPr>
-        <w:t>Trabajo en equipo en entorno industrial</w:t>
-      </w:r>
-    </w:p>
-    <w:p>
-      <w:pPr>
-        <w:rPr>
-          <w:b/>
-          <w:bCs/>
-        </w:rPr>
-      </w:pPr>
-      <w:r>
-        <w:rPr>
-          <w:b/>
-          <w:bCs/>
-        </w:rPr>
-        <w:pict w14:anchorId="186EB0B7">
-          <v:rect id="_x0000_i1171" style="width:0;height:1.5pt" o:hralign="center" o:hrstd="t" o:hr="t" fillcolor="#a0a0a0" stroked="f"/>
-        </w:pict>
-      </w:r>
-    </w:p>
-    <w:p>
-      <w:pPr>
-        <w:rPr>
-          <w:b/>
-          <w:bCs/>
-        </w:rPr>
-      </w:pPr>
-      <w:r>
-        <w:rPr>
-          <w:b/>
-          <w:bCs/>
-        </w:rPr>
         <w:t>COMPETENCIAS TÉCNICAS</w:t>
       </w:r>
     </w:p>
@@ -815,6 +535,41 @@
         </w:rPr>
         <w:br/>
         <w:t>Frontend: HTML5, CSS3, Tailwind CSS, Responsive Design</w:t>
+      </w:r>
+      <w:r>
+        <w:rPr>
+          <w:b/>
+          <w:bCs/>
+        </w:rPr>
+        <w:t xml:space="preserve"> </w:t>
+      </w:r>
+      <w:r>
+        <w:rPr>
+          <w:b/>
+          <w:bCs/>
+        </w:rPr>
+        <w:br/>
+      </w:r>
+      <w:r>
+        <w:rPr>
+          <w:b/>
+          <w:bCs/>
+        </w:rPr>
+        <w:t>Backend</w:t>
+      </w:r>
+      <w:r>
+        <w:rPr>
+          <w:b/>
+          <w:bCs/>
+        </w:rPr>
+        <w:t xml:space="preserve">: </w:t>
+      </w:r>
+      <w:r>
+        <w:rPr>
+          <w:b/>
+          <w:bCs/>
+        </w:rPr>
+        <w:t>PHP 8, Laravel</w:t>
       </w:r>
       <w:r>
         <w:rPr>
@@ -846,7 +601,7 @@
           <w:bCs/>
         </w:rPr>
         <w:pict w14:anchorId="697E28E8">
-          <v:rect id="_x0000_i1172" style="width:0;height:1.5pt" o:hralign="center" o:hrstd="t" o:hr="t" fillcolor="#a0a0a0" stroked="f"/>
+          <v:rect id="_x0000_i1030" style="width:0;height:1.5pt" o:hralign="center" o:hrstd="t" o:hr="t" fillcolor="#a0a0a0" stroked="f"/>
         </w:pict>
       </w:r>
     </w:p>
@@ -881,6 +636,7 @@
           <w:b/>
           <w:bCs/>
         </w:rPr>
+        <w:lastRenderedPageBreak/>
         <w:t>Español: Nativo</w:t>
       </w:r>
     </w:p>
@@ -916,7 +672,7 @@
           <w:bCs/>
         </w:rPr>
         <w:pict w14:anchorId="27F4309D">
-          <v:rect id="_x0000_i1173" style="width:0;height:1.5pt" o:hralign="center" o:hrstd="t" o:hr="t" fillcolor="#a0a0a0" stroked="f"/>
+          <v:rect id="_x0000_i1031" style="width:0;height:1.5pt" o:hralign="center" o:hrstd="t" o:hr="t" fillcolor="#a0a0a0" stroked="f"/>
         </w:pict>
       </w:r>
     </w:p>
@@ -952,6 +708,20 @@
           <w:bCs/>
         </w:rPr>
         <w:t>Interés en desarrollo web frontend</w:t>
+      </w:r>
+      <w:r>
+        <w:rPr>
+          <w:b/>
+          <w:bCs/>
+        </w:rPr>
+        <w:t>/</w:t>
+      </w:r>
+      <w:r>
+        <w:rPr>
+          <w:b/>
+          <w:bCs/>
+        </w:rPr>
+        <w:t>backend</w:t>
       </w:r>
     </w:p>
     <w:p>
@@ -995,7 +765,7 @@
     <w:p/>
     <w:sectPr>
       <w:pgSz w:w="11906" w:h="16838"/>
-      <w:pgMar w:top="1417" w:right="1701" w:bottom="1417" w:left="1701" w:header="708" w:footer="708" w:gutter="0"/>
+      <w:pgMar w:top="720" w:right="720" w:bottom="720" w:left="720" w:header="708" w:footer="708" w:gutter="0"/>
       <w:cols w:space="708"/>
       <w:docGrid w:linePitch="360"/>
     </w:sectPr>
@@ -5563,6 +5333,7 @@
   <w:style w:type="character" w:default="1" w:styleId="Fuentedeprrafopredeter">
     <w:name w:val="Default Paragraph Font"/>
     <w:uiPriority w:val="1"/>
+    <w:semiHidden/>
     <w:unhideWhenUsed/>
   </w:style>
   <w:style w:type="table" w:default="1" w:styleId="Tablanormal">

</xml_diff>